<commit_message>
Update footer with video links
</commit_message>
<xml_diff>
--- a/wdd330-professional-development.docx
+++ b/wdd330-professional-development.docx
@@ -581,7 +581,23 @@
                 <w:sz w:val="24"/>
                 <w:szCs w:val="24"/>
               </w:rPr>
-              <w:t>You are progressing nicely in this area and meet expectations.</w:t>
+              <w:t xml:space="preserve">You are progressing nicely in this area and </w:t>
+            </w:r>
+            <w:proofErr w:type="gramStart"/>
+            <w:r>
+              <w:rPr>
+                <w:sz w:val="24"/>
+                <w:szCs w:val="24"/>
+              </w:rPr>
+              <w:t>meet</w:t>
+            </w:r>
+            <w:proofErr w:type="gramEnd"/>
+            <w:r>
+              <w:rPr>
+                <w:sz w:val="24"/>
+                <w:szCs w:val="24"/>
+              </w:rPr>
+              <w:t xml:space="preserve"> expectations.</w:t>
             </w:r>
           </w:p>
         </w:tc>
@@ -1097,38 +1113,98 @@
                 <w:sz w:val="18"/>
                 <w:szCs w:val="18"/>
               </w:rPr>
-              <w:t>contribute to our project. My natural instinct in this case would have been to get the problem done on my own, but instead, I worked together with my teammate to get him started and then I followed up with him afterward to make sure he was able to get his task done.</w:t>
-            </w:r>
-          </w:p>
-          <w:p>
-            <w:pPr>
-              <w:pStyle w:val="NoSpacing"/>
+              <w:t xml:space="preserve">contribute to our project. My </w:t>
+            </w:r>
+            <w:proofErr w:type="gramStart"/>
+            <w:r>
               <w:rPr>
                 <w:i/>
                 <w:iCs/>
                 <w:sz w:val="18"/>
                 <w:szCs w:val="18"/>
               </w:rPr>
-            </w:pPr>
-          </w:p>
-          <w:p>
-            <w:pPr>
-              <w:pStyle w:val="NoSpacing"/>
+              <w:t>natural instinct</w:t>
+            </w:r>
+            <w:proofErr w:type="gramEnd"/>
+            <w:r>
               <w:rPr>
                 <w:i/>
                 <w:iCs/>
                 <w:sz w:val="18"/>
                 <w:szCs w:val="18"/>
               </w:rPr>
-            </w:pPr>
-            <w:r>
+              <w:t xml:space="preserve"> in this case would have been to get the problem done on my own, but instead, I worked together with my teammate to get him started and then I followed up with him afterward to make sure he was able to get his task done.</w:t>
+            </w:r>
+          </w:p>
+          <w:p>
+            <w:pPr>
+              <w:pStyle w:val="NoSpacing"/>
               <w:rPr>
                 <w:i/>
                 <w:iCs/>
                 <w:sz w:val="18"/>
                 <w:szCs w:val="18"/>
               </w:rPr>
-              <w:t>This definitely took more of my time, but I was really glad to see his spirits lifted as he made progress.</w:t>
+            </w:pPr>
+          </w:p>
+          <w:p>
+            <w:pPr>
+              <w:pStyle w:val="NoSpacing"/>
+              <w:rPr>
+                <w:i/>
+                <w:iCs/>
+                <w:sz w:val="18"/>
+                <w:szCs w:val="18"/>
+              </w:rPr>
+            </w:pPr>
+            <w:r>
+              <w:rPr>
+                <w:i/>
+                <w:iCs/>
+                <w:sz w:val="18"/>
+                <w:szCs w:val="18"/>
+              </w:rPr>
+              <w:t xml:space="preserve">This </w:t>
+            </w:r>
+            <w:proofErr w:type="gramStart"/>
+            <w:r>
+              <w:rPr>
+                <w:i/>
+                <w:iCs/>
+                <w:sz w:val="18"/>
+                <w:szCs w:val="18"/>
+              </w:rPr>
+              <w:t>definitely took</w:t>
+            </w:r>
+            <w:proofErr w:type="gramEnd"/>
+            <w:r>
+              <w:rPr>
+                <w:i/>
+                <w:iCs/>
+                <w:sz w:val="18"/>
+                <w:szCs w:val="18"/>
+              </w:rPr>
+              <w:t xml:space="preserve"> more of my time, but I was </w:t>
+            </w:r>
+            <w:proofErr w:type="gramStart"/>
+            <w:r>
+              <w:rPr>
+                <w:i/>
+                <w:iCs/>
+                <w:sz w:val="18"/>
+                <w:szCs w:val="18"/>
+              </w:rPr>
+              <w:t>really glad</w:t>
+            </w:r>
+            <w:proofErr w:type="gramEnd"/>
+            <w:r>
+              <w:rPr>
+                <w:i/>
+                <w:iCs/>
+                <w:sz w:val="18"/>
+                <w:szCs w:val="18"/>
+              </w:rPr>
+              <w:t xml:space="preserve"> to see his spirits lifted as he made progress.</w:t>
             </w:r>
           </w:p>
         </w:tc>
@@ -1684,7 +1760,7 @@
               <w:jc w:val="center"/>
             </w:pPr>
             <w:r>
-              <w:t>2</w:t>
+              <w:t>3</w:t>
             </w:r>
           </w:p>
         </w:tc>
@@ -2032,25 +2108,25 @@
               <w:jc w:val="center"/>
             </w:pPr>
             <w:r>
+              <w:t>3</w:t>
+            </w:r>
+          </w:p>
+        </w:tc>
+        <w:tc>
+          <w:tcPr>
+            <w:tcW w:w="999" w:type="dxa"/>
+          </w:tcPr>
+          <w:p>
+            <w:pPr>
+              <w:pStyle w:val="NoSpacing"/>
+            </w:pPr>
+            <w:r>
               <w:t>2</w:t>
             </w:r>
           </w:p>
         </w:tc>
         <w:tc>
           <w:tcPr>
-            <w:tcW w:w="999" w:type="dxa"/>
-          </w:tcPr>
-          <w:p>
-            <w:pPr>
-              <w:pStyle w:val="NoSpacing"/>
-            </w:pPr>
-            <w:r>
-              <w:t>2</w:t>
-            </w:r>
-          </w:p>
-        </w:tc>
-        <w:tc>
-          <w:tcPr>
             <w:tcW w:w="5181" w:type="dxa"/>
           </w:tcPr>
           <w:p>
@@ -2058,7 +2134,15 @@
               <w:pStyle w:val="NoSpacing"/>
             </w:pPr>
             <w:r>
-              <w:t>During our second week of the block, we had to tackle our very first individual task, where we each completed a task from the Trello Board. Essentially, we just chose whatever task we wanted to complete and went from there. Our team leader merged the branches and our tasks were complete.</w:t>
+              <w:t xml:space="preserve">During our second week of the block, we had to tackle our very first individual task, where we each completed a task from the Trello Board. Essentially, we just chose whatever task we wanted to complete and went from there. Our team leader </w:t>
+            </w:r>
+            <w:proofErr w:type="gramStart"/>
+            <w:r>
+              <w:t>merged</w:t>
+            </w:r>
+            <w:proofErr w:type="gramEnd"/>
+            <w:r>
+              <w:t xml:space="preserve"> the branches and our tasks were complete.</w:t>
             </w:r>
           </w:p>
         </w:tc>
@@ -2218,25 +2302,25 @@
               <w:jc w:val="center"/>
             </w:pPr>
             <w:r>
+              <w:t>3</w:t>
+            </w:r>
+          </w:p>
+        </w:tc>
+        <w:tc>
+          <w:tcPr>
+            <w:tcW w:w="999" w:type="dxa"/>
+          </w:tcPr>
+          <w:p>
+            <w:pPr>
+              <w:pStyle w:val="NoSpacing"/>
+            </w:pPr>
+            <w:r>
               <w:t>2</w:t>
             </w:r>
           </w:p>
         </w:tc>
         <w:tc>
           <w:tcPr>
-            <w:tcW w:w="999" w:type="dxa"/>
-          </w:tcPr>
-          <w:p>
-            <w:pPr>
-              <w:pStyle w:val="NoSpacing"/>
-            </w:pPr>
-            <w:r>
-              <w:t>2</w:t>
-            </w:r>
-          </w:p>
-        </w:tc>
-        <w:tc>
-          <w:tcPr>
             <w:tcW w:w="5181" w:type="dxa"/>
           </w:tcPr>
           <w:p>
@@ -2244,7 +2328,15 @@
               <w:pStyle w:val="NoSpacing"/>
             </w:pPr>
             <w:r>
-              <w:t xml:space="preserve">During the second week of the block, we had to do our own individual tasks. Although everything went great for me, my team leader didn’t merge my branch, so my results didn’t appear on the live web application. The good thing is that I worked things out </w:t>
+              <w:t xml:space="preserve">During the second week of the block, we had to do our own individual tasks. Although everything went great for me, my team leader didn’t </w:t>
+            </w:r>
+            <w:proofErr w:type="gramStart"/>
+            <w:r>
+              <w:t>merge</w:t>
+            </w:r>
+            <w:proofErr w:type="gramEnd"/>
+            <w:r>
+              <w:t xml:space="preserve"> my branch, so my results didn’t appear on the live web application. The good thing is that I worked things out </w:t>
             </w:r>
             <w:r>
               <w:lastRenderedPageBreak/>
@@ -4086,6 +4178,21 @@
 </file>
 
 <file path=customXml/item1.xml><?xml version="1.0" encoding="utf-8"?>
+<?mso-contentType ?>
+<FormTemplates xmlns="http://schemas.microsoft.com/sharepoint/v3/contenttype/forms">
+  <Display>DocumentLibraryForm</Display>
+  <Edit>DocumentLibraryForm</Edit>
+  <New>DocumentLibraryForm</New>
+</FormTemplates>
+</file>
+
+<file path=customXml/item2.xml><?xml version="1.0" encoding="utf-8"?>
+<p:properties xmlns:p="http://schemas.microsoft.com/office/2006/metadata/properties" xmlns:xsi="http://www.w3.org/2001/XMLSchema-instance" xmlns:pc="http://schemas.microsoft.com/office/infopath/2007/PartnerControls">
+  <documentManagement/>
+</p:properties>
+</file>
+
+<file path=customXml/item3.xml><?xml version="1.0" encoding="utf-8"?>
 <ct:contentTypeSchema xmlns:ct="http://schemas.microsoft.com/office/2006/metadata/contentType" xmlns:ma="http://schemas.microsoft.com/office/2006/metadata/properties/metaAttributes" ct:_="" ma:_="" ma:contentTypeName="Document" ma:contentTypeID="0x0101003C76346AFD0E164A896179F8A3CF5BCA" ma:contentTypeVersion="2" ma:contentTypeDescription="Create a new document." ma:contentTypeScope="" ma:versionID="141df0e014df6f30cf97f9d327d4cb77">
   <xsd:schema xmlns:xsd="http://www.w3.org/2001/XMLSchema" xmlns:xs="http://www.w3.org/2001/XMLSchema" xmlns:p="http://schemas.microsoft.com/office/2006/metadata/properties" xmlns:ns2="a858a2f8-06bb-467c-9041-0de76784e431" targetNamespace="http://schemas.microsoft.com/office/2006/metadata/properties" ma:root="true" ma:fieldsID="ae29bf6651c6200169aa9f8965b8a32a" ns2:_="">
     <xsd:import namespace="a858a2f8-06bb-467c-9041-0de76784e431"/>
@@ -4217,22 +4324,24 @@
 </ct:contentTypeSchema>
 </file>
 
-<file path=customXml/item2.xml><?xml version="1.0" encoding="utf-8"?>
-<p:properties xmlns:p="http://schemas.microsoft.com/office/2006/metadata/properties" xmlns:xsi="http://www.w3.org/2001/XMLSchema-instance" xmlns:pc="http://schemas.microsoft.com/office/infopath/2007/PartnerControls">
-  <documentManagement/>
-</p:properties>
+<file path=customXml/itemProps1.xml><?xml version="1.0" encoding="utf-8"?>
+<ds:datastoreItem xmlns:ds="http://schemas.openxmlformats.org/officeDocument/2006/customXml" ds:itemID="{D02D787C-96F3-476C-AC00-5E042564F4E3}">
+  <ds:schemaRefs>
+    <ds:schemaRef ds:uri="http://schemas.microsoft.com/sharepoint/v3/contenttype/forms"/>
+  </ds:schemaRefs>
+</ds:datastoreItem>
 </file>
 
-<file path=customXml/item3.xml><?xml version="1.0" encoding="utf-8"?>
-<?mso-contentType ?>
-<FormTemplates xmlns="http://schemas.microsoft.com/sharepoint/v3/contenttype/forms">
-  <Display>DocumentLibraryForm</Display>
-  <Edit>DocumentLibraryForm</Edit>
-  <New>DocumentLibraryForm</New>
-</FormTemplates>
+<file path=customXml/itemProps2.xml><?xml version="1.0" encoding="utf-8"?>
+<ds:datastoreItem xmlns:ds="http://schemas.openxmlformats.org/officeDocument/2006/customXml" ds:itemID="{B9AEEB80-803A-4749-92D8-ADC156A01D53}">
+  <ds:schemaRefs>
+    <ds:schemaRef ds:uri="http://schemas.microsoft.com/office/2006/metadata/properties"/>
+    <ds:schemaRef ds:uri="http://schemas.microsoft.com/office/infopath/2007/PartnerControls"/>
+  </ds:schemaRefs>
+</ds:datastoreItem>
 </file>
 
-<file path=customXml/itemProps1.xml><?xml version="1.0" encoding="utf-8"?>
+<file path=customXml/itemProps3.xml><?xml version="1.0" encoding="utf-8"?>
 <ds:datastoreItem xmlns:ds="http://schemas.openxmlformats.org/officeDocument/2006/customXml" ds:itemID="{8BAA337E-7A54-4158-9D91-D28F83B48D18}">
   <ds:schemaRefs>
     <ds:schemaRef ds:uri="http://schemas.microsoft.com/office/2006/metadata/contentType"/>
@@ -4248,21 +4357,4 @@
     <ds:schemaRef ds:uri="http://schemas.microsoft.com/internal/obd"/>
   </ds:schemaRefs>
 </ds:datastoreItem>
-</file>
-
-<file path=customXml/itemProps2.xml><?xml version="1.0" encoding="utf-8"?>
-<ds:datastoreItem xmlns:ds="http://schemas.openxmlformats.org/officeDocument/2006/customXml" ds:itemID="{B9AEEB80-803A-4749-92D8-ADC156A01D53}">
-  <ds:schemaRefs>
-    <ds:schemaRef ds:uri="http://schemas.microsoft.com/office/2006/metadata/properties"/>
-    <ds:schemaRef ds:uri="http://schemas.microsoft.com/office/infopath/2007/PartnerControls"/>
-  </ds:schemaRefs>
-</ds:datastoreItem>
-</file>
-
-<file path=customXml/itemProps3.xml><?xml version="1.0" encoding="utf-8"?>
-<ds:datastoreItem xmlns:ds="http://schemas.openxmlformats.org/officeDocument/2006/customXml" ds:itemID="{D02D787C-96F3-476C-AC00-5E042564F4E3}">
-  <ds:schemaRefs>
-    <ds:schemaRef ds:uri="http://schemas.microsoft.com/sharepoint/v3/contenttype/forms"/>
-  </ds:schemaRefs>
-</ds:datastoreItem>
 </file>
</xml_diff>